<commit_message>
feat(legal): add employee IP labor contract, finalize all appendices with vietnam header format and clean single-built docx
</commit_message>
<xml_diff>
--- a/legal/05-content/08_PHU_LUC_CONTENT_SOCIAL.docx
+++ b/legal/05-content/08_PHU_LUC_CONTENT_SOCIAL.docx
@@ -2,24 +2,172 @@
 <file path=word/document.xml><?xml version="1.0" encoding="utf-8"?>
 <w:document xmlns:wpc="http://schemas.microsoft.com/office/word/2010/wordprocessingCanvas" xmlns:mo="http://schemas.microsoft.com/office/mac/office/2008/main" xmlns:mc="http://schemas.openxmlformats.org/markup-compatibility/2006" xmlns:mv="urn:schemas-microsoft-com:mac:vml" xmlns:o="urn:schemas-microsoft-com:office:office" xmlns:r="http://schemas.openxmlformats.org/officeDocument/2006/relationships" xmlns:m="http://schemas.openxmlformats.org/officeDocument/2006/math" xmlns:v="urn:schemas-microsoft-com:vml" xmlns:wp14="http://schemas.microsoft.com/office/word/2010/wordprocessingDrawing" xmlns:wp="http://schemas.openxmlformats.org/drawingml/2006/wordprocessingDrawing" xmlns:w10="urn:schemas-microsoft-com:office:word" xmlns:w="http://schemas.openxmlformats.org/wordprocessingml/2006/main" xmlns:w14="http://schemas.microsoft.com/office/word/2010/wordml" xmlns:wpg="http://schemas.microsoft.com/office/word/2010/wordprocessingGroup" xmlns:wpi="http://schemas.microsoft.com/office/word/2010/wordprocessingInk" xmlns:wne="http://schemas.microsoft.com/office/word/2006/wordml" xmlns:wps="http://schemas.microsoft.com/office/word/2010/wordprocessingShape" mc:Ignorable="w14 wp14">
   <w:body>
+    <w:tbl>
+      <w:tblPr>
+        <w:tblW w:type="auto" w:w="0"/>
+        <w:jc w:val="center"/>
+        <w:tblLook w:firstColumn="1" w:firstRow="1" w:lastColumn="0" w:lastRow="0" w:noHBand="0" w:noVBand="1" w:val="04A0"/>
+        <w:tblBorders>
+          <w:top w:val="none"/>
+          <w:bottom w:val="none"/>
+          <w:left w:val="none"/>
+          <w:right w:val="none"/>
+          <w:insideH w:val="none"/>
+          <w:insideV w:val="none"/>
+        </w:tblBorders>
+      </w:tblPr>
+      <w:tblGrid>
+        <w:gridCol w:w="4874"/>
+        <w:gridCol w:w="4874"/>
+      </w:tblGrid>
+      <w:tr>
+        <w:trPr>
+          <w:cantSplit/>
+        </w:trPr>
+        <w:tc>
+          <w:tcPr>
+            <w:tcW w:type="dxa" w:w="4032"/>
+            <w:vAlign w:val="center"/>
+            <w:tcW w:w="4031" w:type="dxa"/>
+            <w:tcMar>
+              <w:top w:w="40" w:type="dxa"/>
+              <w:bottom w:w="40" w:type="dxa"/>
+              <w:left w:w="60" w:type="dxa"/>
+              <w:right w:w="60" w:type="dxa"/>
+            </w:tcMar>
+            <w:shd w:fill="FFFFFF"/>
+          </w:tcPr>
+          <w:p>
+            <w:r/>
+          </w:p>
+          <w:p>
+            <w:pPr>
+              <w:spacing w:before="0" w:after="40" w:line="276" w:lineRule="auto"/>
+              <w:jc w:val="center"/>
+            </w:pPr>
+            <w:r>
+              <w:rPr>
+                <w:b/>
+              </w:rPr>
+              <w:t>ĐƠN VỊ CUNG CẤP DỊCH VỤ</w:t>
+            </w:r>
+          </w:p>
+          <w:p>
+            <w:pPr>
+              <w:spacing w:before="0" w:after="40" w:line="276" w:lineRule="auto"/>
+              <w:jc w:val="center"/>
+            </w:pPr>
+            <w:r>
+              <w:rPr>
+                <w:b/>
+              </w:rPr>
+              <w:t>LOCALMATE VIỆT NAM</w:t>
+            </w:r>
+          </w:p>
+          <w:p>
+            <w:pPr>
+              <w:spacing w:before="0" w:after="40" w:line="276" w:lineRule="auto"/>
+              <w:jc w:val="center"/>
+            </w:pPr>
+            <w:r>
+              <w:t>Số: [MÃ_ĐƠN]/PL-CONTENT-LM/[NĂM]</w:t>
+            </w:r>
+          </w:p>
+        </w:tc>
+        <w:tc>
+          <w:tcPr>
+            <w:tcW w:type="dxa" w:w="5717"/>
+            <w:vAlign w:val="center"/>
+            <w:tcW w:w="5716" w:type="dxa"/>
+            <w:tcMar>
+              <w:top w:w="40" w:type="dxa"/>
+              <w:bottom w:w="40" w:type="dxa"/>
+              <w:left w:w="60" w:type="dxa"/>
+              <w:right w:w="60" w:type="dxa"/>
+            </w:tcMar>
+            <w:shd w:fill="FFFFFF"/>
+          </w:tcPr>
+          <w:p>
+            <w:r/>
+          </w:p>
+          <w:p>
+            <w:pPr>
+              <w:spacing w:before="0" w:after="40" w:line="276" w:lineRule="auto"/>
+              <w:jc w:val="center"/>
+            </w:pPr>
+            <w:r>
+              <w:rPr>
+                <w:b/>
+                <w:sz w:val="23"/>
+              </w:rPr>
+              <w:t>CỘNG HÒA XÃ HỘI CHỦ NGHĨA VIỆT NAM</w:t>
+            </w:r>
+          </w:p>
+          <w:p>
+            <w:pPr>
+              <w:spacing w:before="0" w:after="40" w:line="276" w:lineRule="auto"/>
+              <w:jc w:val="center"/>
+            </w:pPr>
+            <w:r>
+              <w:rPr>
+                <w:b/>
+              </w:rPr>
+              <w:t>Độc lập - Tự do - Hạnh phúc</w:t>
+            </w:r>
+          </w:p>
+          <w:p>
+            <w:pPr>
+              <w:spacing w:before="0" w:after="40" w:line="276" w:lineRule="auto"/>
+              <w:jc w:val="center"/>
+            </w:pPr>
+            <w:r>
+              <w:rPr>
+                <w:color w:val="0F172A"/>
+                <w:sz w:val="16"/>
+              </w:rPr>
+              <w:t>――――――――――――――――</w:t>
+            </w:r>
+          </w:p>
+          <w:p>
+            <w:pPr>
+              <w:spacing w:before="0" w:after="40" w:line="276" w:lineRule="auto"/>
+              <w:jc w:val="center"/>
+            </w:pPr>
+            <w:r>
+              <w:rPr>
+                <w:i/>
+                <w:color w:val="64748B"/>
+                <w:sz w:val="19"/>
+              </w:rPr>
+              <w:t>Hà Nội, ngày [NGÀY] tháng [THÁNG] năm 202[NĂM]</w:t>
+            </w:r>
+          </w:p>
+        </w:tc>
+      </w:tr>
+    </w:tbl>
     <w:p>
       <w:pPr>
-        <w:spacing w:before="240" w:after="120" w:line="288" w:lineRule="auto"/>
+        <w:spacing w:before="0" w:after="80"/>
+      </w:pPr>
+    </w:p>
+    <w:p>
+      <w:pPr>
+        <w:spacing w:before="240" w:after="80" w:line="288" w:lineRule="auto"/>
         <w:jc w:val="center"/>
       </w:pPr>
       <w:r>
         <w:rPr>
           <w:b/>
-          <w:color w:val="0D7647"/>
-          <w:sz w:val="30"/>
+          <w:color w:val="0F172A"/>
+          <w:sz w:val="29"/>
         </w:rPr>
-        <w:t>PHỤ LỤC DỊCH VỤ SẢN XUẤT NỘI DUNG &amp; CHĂM SÓC KÊNH SỐ LOCALMATE</w:t>
+        <w:t>PHỤ LỤC DỊCH VỤ SẢN XUẤT NỘI DUNG &amp; CHĂM SÓC KÊNH SỐ</w:t>
       </w:r>
     </w:p>
     <w:p>
       <w:pPr>
-        <w:spacing w:after="80" w:before="0" w:line="276" w:lineRule="auto"/>
-        <w:jc w:val="left"/>
+        <w:spacing w:before="20" w:after="60" w:line="276" w:lineRule="auto"/>
+        <w:jc w:val="both"/>
       </w:pPr>
       <w:r>
         <w:rPr>
@@ -27,65 +175,85 @@
         </w:rPr>
         <w:t>(CONTENT MARKETING &amp; SOCIAL MEDIA CARE APPENDIX)</w:t>
       </w:r>
+    </w:p>
+    <w:p>
+      <w:pPr>
+        <w:spacing w:before="20" w:after="40" w:line="276" w:lineRule="auto"/>
+        <w:ind w:left="288"/>
+        <w:jc w:val="both"/>
+      </w:pPr>
       <w:r>
-        <w:t xml:space="preserve">  </w:t>
+        <w:rPr>
+          <w:i/>
+          <w:color w:val="0F172A"/>
+          <w:sz w:val="20"/>
+        </w:rPr>
+        <w:t>- Căn cứ Luật Thương mại số 36/2005/QH11 ngày 14 tháng 06 năm 2005;</w:t>
       </w:r>
     </w:p>
     <w:p>
       <w:pPr>
-        <w:spacing w:after="80" w:before="0" w:line="276" w:lineRule="auto"/>
+        <w:spacing w:before="20" w:after="40" w:line="276" w:lineRule="auto"/>
+        <w:ind w:left="288"/>
+        <w:jc w:val="both"/>
+      </w:pPr>
+      <w:r>
+        <w:rPr>
+          <w:i/>
+          <w:color w:val="0F172A"/>
+          <w:sz w:val="20"/>
+        </w:rPr>
+        <w:t>- Căn cứ Luật Sở hữu trí tuệ số 50/2005/QH11 đã được sửa đổi, bổ sung theo Luật số 07/2022/QH15;</w:t>
+      </w:r>
+    </w:p>
+    <w:p>
+      <w:pPr>
+        <w:spacing w:before="20" w:after="40" w:line="276" w:lineRule="auto"/>
+        <w:ind w:left="288"/>
+        <w:jc w:val="both"/>
+      </w:pPr>
+      <w:r>
+        <w:rPr>
+          <w:i/>
+          <w:color w:val="0F172A"/>
+          <w:sz w:val="20"/>
+        </w:rPr>
+        <w:t>- Căn cứ Luật An ninh mạng số 24/2018/QH14 ngày 12 tháng 06 năm 2018;</w:t>
+      </w:r>
+    </w:p>
+    <w:p>
+      <w:pPr>
+        <w:spacing w:before="20" w:after="40" w:line="276" w:lineRule="auto"/>
+        <w:ind w:left="288"/>
+        <w:jc w:val="both"/>
+      </w:pPr>
+      <w:r>
+        <w:rPr>
+          <w:i/>
+          <w:color w:val="0F172A"/>
+          <w:sz w:val="20"/>
+        </w:rPr>
+        <w:t>- Căn cứ Hợp đồng Dịch vụ Khung số: [MÃ_HỢP_ĐỒNG] ký giữa Hai Bên.</w:t>
+      </w:r>
+    </w:p>
+    <w:p>
+      <w:pPr>
+        <w:spacing w:before="180" w:after="60" w:line="276" w:lineRule="auto"/>
         <w:jc w:val="left"/>
       </w:pPr>
       <w:r>
         <w:rPr>
           <w:b/>
-        </w:rPr>
-        <w:t>Số hiệu Phụ lục:</w:t>
-      </w:r>
-      <w:r>
-        <w:t xml:space="preserve"> [MÃ_ĐƠN]/PL-CONTENT-LM/[NĂM]  </w:t>
-      </w:r>
-    </w:p>
-    <w:p>
-      <w:pPr>
-        <w:spacing w:after="80" w:before="0" w:line="276" w:lineRule="auto"/>
-        <w:jc w:val="left"/>
-      </w:pPr>
-      <w:r>
-        <w:rPr>
-          <w:i/>
-        </w:rPr>
-        <w:t>(Kèm theo Hợp đồng Dịch vụ Khung số: [MÃ_HỢP_ĐỒNG] ký ngày [NGÀY_KÝ])</w:t>
-      </w:r>
-    </w:p>
-    <w:p>
-      <w:pPr>
-        <w:spacing w:after="120" w:before="80"/>
-      </w:pPr>
-      <w:r>
-        <w:rPr>
-          <w:color w:val="CBD5E1"/>
-        </w:rPr>
-        <w:t>―――――――――――――――――――――――――――――――――――――――――――――――――――――――</w:t>
-      </w:r>
-    </w:p>
-    <w:p>
-      <w:pPr>
-        <w:spacing w:before="160" w:after="60"/>
-      </w:pPr>
-      <w:r>
-        <w:rPr>
-          <w:b/>
-          <w:color w:val="0D7647"/>
-          <w:sz w:val="23"/>
+          <w:color w:val="0F172A"/>
+          <w:sz w:val="22"/>
         </w:rPr>
         <w:t>ĐIỀU 1: PHẠM VI DỊCH VỤ &amp; KHỐI LƯỢNG SẢN PHẨM ĐỊNH LƯỢNG</w:t>
       </w:r>
     </w:p>
     <w:p>
       <w:pPr>
-        <w:spacing w:after="80" w:before="0" w:line="276" w:lineRule="auto"/>
-        <w:jc w:val="left"/>
+        <w:spacing w:before="20" w:after="60" w:line="276" w:lineRule="auto"/>
+        <w:jc w:val="both"/>
       </w:pPr>
       <w:r>
         <w:t>Bên B cung ứng cho Bên A dịch vụ sáng tạo nội dung truyền thông và quản trị kênh số với khối lượng định lượng hàng tháng được quy định cụ thể tại Đơn Đặt Hàng (Service Order):</w:t>
@@ -93,8 +261,8 @@
     </w:p>
     <w:p>
       <w:pPr>
-        <w:spacing w:after="80" w:before="0" w:line="276" w:lineRule="auto"/>
-        <w:jc w:val="left"/>
+        <w:spacing w:before="20" w:after="60" w:line="276" w:lineRule="auto"/>
+        <w:jc w:val="both"/>
       </w:pPr>
       <w:r>
         <w:t xml:space="preserve">1.1. </w:t>
@@ -108,48 +276,48 @@
     </w:p>
     <w:p>
       <w:pPr>
-        <w:spacing w:after="60" w:before="20" w:line="276" w:lineRule="auto"/>
+        <w:spacing w:before="20" w:after="40" w:line="276" w:lineRule="auto"/>
         <w:ind w:left="360"/>
-        <w:jc w:val="left"/>
+        <w:jc w:val="both"/>
       </w:pPr>
       <w:r>
-        <w:t>•  Số lượng bài viết tiêu chuẩn: [SỐ_BÀI] bài/tháng (bao gồm tiêu đề, văn bản truyền thông, hashtag và lời kêu gọi hành động CTA);</w:t>
+        <w:t>Số lượng bài viết tiêu chuẩn: [SỐ_BÀI] bài/tháng (bao gồm tiêu đề, văn bản truyền thông, hashtag và lời kêu gọi hành động CTA);</w:t>
       </w:r>
     </w:p>
     <w:p>
       <w:pPr>
-        <w:spacing w:after="60" w:before="20" w:line="276" w:lineRule="auto"/>
+        <w:spacing w:before="20" w:after="40" w:line="276" w:lineRule="auto"/>
         <w:ind w:left="360"/>
-        <w:jc w:val="left"/>
+        <w:jc w:val="both"/>
       </w:pPr>
       <w:r>
-        <w:t>•  Số lượng hình ảnh thiết kế: [SỐ_ẢNH] ảnh/tháng (thiết kế theo nhận diện thương hiệu, kích thước chuẩn Facebook, Instagram, Website);</w:t>
+        <w:t>Số lượng hình ảnh thiết kế: [SỐ_ẢNH] ảnh/tháng (thiết kế theo nhận diện thương hiệu, kích thước chuẩn Facebook, Instagram, Website);</w:t>
       </w:r>
     </w:p>
     <w:p>
       <w:pPr>
-        <w:spacing w:after="60" w:before="20" w:line="276" w:lineRule="auto"/>
+        <w:spacing w:before="20" w:after="40" w:line="276" w:lineRule="auto"/>
         <w:ind w:left="360"/>
-        <w:jc w:val="left"/>
+        <w:jc w:val="both"/>
       </w:pPr>
       <w:r>
-        <w:t>•  Số lượng video ngắn (Reels/TikTok/Shorts): [SỐ_VIDEO] video/tháng (thời lượng 30 - 60 giây, dựng dọc, phụ đề tự động);</w:t>
+        <w:t>Số lượng video ngắn (Reels/TikTok/Shorts): [SỐ_VIDEO] video/tháng (thời lượng 30 - 60 giây, dựng dọc, phụ đề tự động);</w:t>
       </w:r>
     </w:p>
     <w:p>
       <w:pPr>
-        <w:spacing w:after="60" w:before="20" w:line="276" w:lineRule="auto"/>
+        <w:spacing w:before="20" w:after="40" w:line="276" w:lineRule="auto"/>
         <w:ind w:left="360"/>
-        <w:jc w:val="left"/>
+        <w:jc w:val="both"/>
       </w:pPr>
       <w:r>
-        <w:t xml:space="preserve">•  Kênh phát hành (Channels): [ ] Fanpage Facebook | [ ] Kênh TikTok | [ ] Website Blog | [ ] Google Business Profile Updates | [ ] Zalo OA.  </w:t>
+        <w:t>Kênh phát hành (Channels): [ ] Fanpage Facebook | [ ] Kênh TikTok | [ ] Website Blog | [ ] Google Business Profile Updates | [ ] Zalo OA.</w:t>
       </w:r>
     </w:p>
     <w:p>
       <w:pPr>
-        <w:spacing w:after="80" w:before="0" w:line="276" w:lineRule="auto"/>
-        <w:jc w:val="left"/>
+        <w:spacing w:before="20" w:after="60" w:line="276" w:lineRule="auto"/>
+        <w:jc w:val="both"/>
       </w:pPr>
       <w:r>
         <w:t xml:space="preserve">1.2. </w:t>
@@ -166,32 +334,22 @@
     </w:p>
     <w:p>
       <w:pPr>
-        <w:spacing w:after="120" w:before="80"/>
-      </w:pPr>
-      <w:r>
-        <w:rPr>
-          <w:color w:val="CBD5E1"/>
-        </w:rPr>
-        <w:t>―――――――――――――――――――――――――――――――――――――――――――――――――――――――</w:t>
-      </w:r>
-    </w:p>
-    <w:p>
-      <w:pPr>
-        <w:spacing w:before="160" w:after="60"/>
+        <w:spacing w:before="180" w:after="60" w:line="276" w:lineRule="auto"/>
+        <w:jc w:val="left"/>
       </w:pPr>
       <w:r>
         <w:rPr>
           <w:b/>
-          <w:color w:val="0D7647"/>
-          <w:sz w:val="23"/>
+          <w:color w:val="0F172A"/>
+          <w:sz w:val="22"/>
         </w:rPr>
         <w:t>ĐIỀU 2: QUY TRÌNH PHÊ DUYỆT 4 BƯỚC BẮT BUỘC (APPROVAL WORKFLOW)</w:t>
       </w:r>
     </w:p>
     <w:p>
       <w:pPr>
-        <w:spacing w:after="80" w:before="0" w:line="276" w:lineRule="auto"/>
-        <w:jc w:val="left"/>
+        <w:spacing w:before="20" w:after="60" w:line="276" w:lineRule="auto"/>
+        <w:jc w:val="both"/>
       </w:pPr>
       <w:r>
         <w:t>Nhằm bảo đảm nội dung phát hành chính xác, đúng định hướng và có bằng chứng pháp lý rõ ràng, Các Bên tuân thủ quy trình 4 trạng thái bất biến:</w:t>
@@ -199,14 +357,13 @@
     </w:p>
     <w:p>
       <w:pPr>
-        <w:spacing w:after="80" w:before="0" w:line="276" w:lineRule="auto"/>
-        <w:jc w:val="left"/>
+        <w:spacing w:before="20" w:after="60" w:line="276" w:lineRule="auto"/>
+        <w:jc w:val="both"/>
       </w:pPr>
       <w:r>
         <w:rPr>
           <w:rFonts w:ascii="Consolas" w:hAnsi="Consolas"/>
-          <w:color w:val="B42828"/>
-          <w:sz w:val="20"/>
+          <w:sz w:val="19"/>
         </w:rPr>
       </w:r>
       <w:r>
@@ -215,8 +372,8 @@
     </w:p>
     <w:p>
       <w:pPr>
-        <w:spacing w:after="80" w:before="0" w:line="276" w:lineRule="auto"/>
-        <w:jc w:val="left"/>
+        <w:spacing w:before="20" w:after="60" w:line="276" w:lineRule="auto"/>
+        <w:jc w:val="both"/>
       </w:pPr>
       <w:r>
         <w:t xml:space="preserve">    [ BƯỚC 1: DRAFT ]       ──►       [ BƯỚC 2: REVIEW ]</w:t>
@@ -224,8 +381,8 @@
     </w:p>
     <w:p>
       <w:pPr>
-        <w:spacing w:after="80" w:before="0" w:line="276" w:lineRule="auto"/>
-        <w:jc w:val="left"/>
+        <w:spacing w:before="20" w:after="60" w:line="276" w:lineRule="auto"/>
+        <w:jc w:val="both"/>
       </w:pPr>
       <w:r>
         <w:t xml:space="preserve">    (Bên B sáng tạo,                  (Bên B gửi bài, Bên A</w:t>
@@ -233,8 +390,8 @@
     </w:p>
     <w:p>
       <w:pPr>
-        <w:spacing w:after="80" w:before="0" w:line="276" w:lineRule="auto"/>
-        <w:jc w:val="left"/>
+        <w:spacing w:before="20" w:after="60" w:line="276" w:lineRule="auto"/>
+        <w:jc w:val="both"/>
       </w:pPr>
       <w:r>
         <w:t xml:space="preserve">     biên tập nội dung)                kiểm tra &amp; gửi góp ý)</w:t>
@@ -242,8 +399,8 @@
     </w:p>
     <w:p>
       <w:pPr>
-        <w:spacing w:after="80" w:before="0" w:line="276" w:lineRule="auto"/>
-        <w:jc w:val="left"/>
+        <w:spacing w:before="20" w:after="60" w:line="276" w:lineRule="auto"/>
+        <w:jc w:val="both"/>
       </w:pPr>
       <w:r>
         <w:t xml:space="preserve">            │                                  │</w:t>
@@ -251,8 +408,8 @@
     </w:p>
     <w:p>
       <w:pPr>
-        <w:spacing w:after="80" w:before="0" w:line="276" w:lineRule="auto"/>
-        <w:jc w:val="left"/>
+        <w:spacing w:before="20" w:after="60" w:line="276" w:lineRule="auto"/>
+        <w:jc w:val="both"/>
       </w:pPr>
       <w:r>
         <w:t xml:space="preserve">            ▼                                  ▼</w:t>
@@ -260,8 +417,8 @@
     </w:p>
     <w:p>
       <w:pPr>
-        <w:spacing w:after="80" w:before="0" w:line="276" w:lineRule="auto"/>
-        <w:jc w:val="left"/>
+        <w:spacing w:before="20" w:after="60" w:line="276" w:lineRule="auto"/>
+        <w:jc w:val="both"/>
       </w:pPr>
       <w:r>
         <w:t xml:space="preserve">   [ BƯỚC 4: PUBLISHED ]    ◄──      [ BƯỚC 3: APPROVED ]</w:t>
@@ -269,8 +426,8 @@
     </w:p>
     <w:p>
       <w:pPr>
-        <w:spacing w:after="80" w:before="0" w:line="276" w:lineRule="auto"/>
-        <w:jc w:val="left"/>
+        <w:spacing w:before="20" w:after="60" w:line="276" w:lineRule="auto"/>
+        <w:jc w:val="both"/>
       </w:pPr>
       <w:r>
         <w:t xml:space="preserve">   (Bên B lên lịch đăng              (Bên A ký duyệt hoặc</w:t>
@@ -278,8 +435,8 @@
     </w:p>
     <w:p>
       <w:pPr>
-        <w:spacing w:after="80" w:before="0" w:line="276" w:lineRule="auto"/>
-        <w:jc w:val="left"/>
+        <w:spacing w:before="20" w:after="60" w:line="276" w:lineRule="auto"/>
+        <w:jc w:val="both"/>
       </w:pPr>
       <w:r>
         <w:t xml:space="preserve">    sau khi có xác nhận)              xác nhận qua Zalo/Email)</w:t>
@@ -287,14 +444,13 @@
     </w:p>
     <w:p>
       <w:pPr>
-        <w:spacing w:after="80" w:before="0" w:line="276" w:lineRule="auto"/>
-        <w:jc w:val="left"/>
+        <w:spacing w:before="20" w:after="60" w:line="276" w:lineRule="auto"/>
+        <w:jc w:val="both"/>
       </w:pPr>
       <w:r>
         <w:rPr>
           <w:rFonts w:ascii="Consolas" w:hAnsi="Consolas"/>
-          <w:color w:val="B42828"/>
-          <w:sz w:val="20"/>
+          <w:sz w:val="19"/>
         </w:rPr>
       </w:r>
       <w:r>
@@ -303,8 +459,8 @@
     </w:p>
     <w:p>
       <w:pPr>
-        <w:spacing w:after="80" w:before="0" w:line="276" w:lineRule="auto"/>
-        <w:jc w:val="left"/>
+        <w:spacing w:before="20" w:after="60" w:line="276" w:lineRule="auto"/>
+        <w:jc w:val="both"/>
       </w:pPr>
       <w:r>
         <w:t xml:space="preserve">2.1. </w:t>
@@ -321,8 +477,8 @@
     </w:p>
     <w:p>
       <w:pPr>
-        <w:spacing w:after="80" w:before="0" w:line="276" w:lineRule="auto"/>
-        <w:jc w:val="left"/>
+        <w:spacing w:before="20" w:after="60" w:line="276" w:lineRule="auto"/>
+        <w:jc w:val="both"/>
       </w:pPr>
       <w:r>
         <w:t xml:space="preserve">2.2. </w:t>
@@ -348,8 +504,8 @@
     </w:p>
     <w:p>
       <w:pPr>
-        <w:spacing w:after="80" w:before="0" w:line="276" w:lineRule="auto"/>
-        <w:jc w:val="left"/>
+        <w:spacing w:before="20" w:after="60" w:line="276" w:lineRule="auto"/>
+        <w:jc w:val="both"/>
       </w:pPr>
       <w:r>
         <w:t xml:space="preserve">2.3. </w:t>
@@ -363,12 +519,12 @@
     </w:p>
     <w:p>
       <w:pPr>
-        <w:spacing w:after="60" w:before="20" w:line="276" w:lineRule="auto"/>
+        <w:spacing w:before="20" w:after="40" w:line="276" w:lineRule="auto"/>
         <w:ind w:left="360"/>
-        <w:jc w:val="left"/>
+        <w:jc w:val="both"/>
       </w:pPr>
       <w:r>
-        <w:t xml:space="preserve">•  Bên A có thời hạn tối đa </w:t>
+        <w:t xml:space="preserve">Bên A có thời hạn tối đa </w:t>
       </w:r>
       <w:r>
         <w:rPr>
@@ -382,12 +538,12 @@
     </w:p>
     <w:p>
       <w:pPr>
-        <w:spacing w:after="60" w:before="20" w:line="276" w:lineRule="auto"/>
+        <w:spacing w:before="20" w:after="40" w:line="276" w:lineRule="auto"/>
         <w:ind w:left="360"/>
-        <w:jc w:val="left"/>
+        <w:jc w:val="both"/>
       </w:pPr>
       <w:r>
-        <w:t xml:space="preserve">•  Bên A được quyền yêu cầu tối đa </w:t>
+        <w:t xml:space="preserve">Bên A được quyền yêu cầu tối đa </w:t>
       </w:r>
       <w:r>
         <w:rPr>
@@ -401,12 +557,12 @@
     </w:p>
     <w:p>
       <w:pPr>
-        <w:spacing w:after="60" w:before="20" w:line="276" w:lineRule="auto"/>
+        <w:spacing w:before="20" w:after="40" w:line="276" w:lineRule="auto"/>
         <w:ind w:left="360"/>
-        <w:jc w:val="left"/>
+        <w:jc w:val="both"/>
       </w:pPr>
       <w:r>
-        <w:t xml:space="preserve">•  Trường hợp Bên A im lặng không phản hồi sau 24 giờ kể từ khi Bên B đã gửi lời nhắc lần 2, nội dung được </w:t>
+        <w:t xml:space="preserve">Trường hợp Bên A im lặng không phản hồi sau 24 giờ kể từ khi Bên B đã gửi lời nhắc lần 2, nội dung được </w:t>
       </w:r>
       <w:r>
         <w:rPr>
@@ -415,13 +571,13 @@
         <w:t>MẶC NHIÊN COI LÀ ĐÃ ĐƯỢC PHÊ DUYỆT (Silent Approval)</w:t>
       </w:r>
       <w:r>
-        <w:t xml:space="preserve"> và Bên B có quyền lên lịch đăng theo đúng kế hoạch.  </w:t>
+        <w:t xml:space="preserve"> và Bên B có quyền lên lịch đăng theo đúng kế hoạch.</w:t>
       </w:r>
     </w:p>
     <w:p>
       <w:pPr>
-        <w:spacing w:after="80" w:before="0" w:line="276" w:lineRule="auto"/>
-        <w:jc w:val="left"/>
+        <w:spacing w:before="20" w:after="60" w:line="276" w:lineRule="auto"/>
+        <w:jc w:val="both"/>
       </w:pPr>
       <w:r>
         <w:t xml:space="preserve">2.4. </w:t>
@@ -456,8 +612,8 @@
     </w:p>
     <w:p>
       <w:pPr>
-        <w:spacing w:after="80" w:before="0" w:line="276" w:lineRule="auto"/>
-        <w:jc w:val="left"/>
+        <w:spacing w:before="20" w:after="60" w:line="276" w:lineRule="auto"/>
+        <w:jc w:val="both"/>
       </w:pPr>
       <w:r>
         <w:t xml:space="preserve">2.5. </w:t>
@@ -474,32 +630,22 @@
     </w:p>
     <w:p>
       <w:pPr>
-        <w:spacing w:after="120" w:before="80"/>
-      </w:pPr>
-      <w:r>
-        <w:rPr>
-          <w:color w:val="CBD5E1"/>
-        </w:rPr>
-        <w:t>―――――――――――――――――――――――――――――――――――――――――――――――――――――――</w:t>
-      </w:r>
-    </w:p>
-    <w:p>
-      <w:pPr>
-        <w:spacing w:before="160" w:after="60"/>
+        <w:spacing w:before="180" w:after="60" w:line="276" w:lineRule="auto"/>
+        <w:jc w:val="left"/>
       </w:pPr>
       <w:r>
         <w:rPr>
           <w:b/>
-          <w:color w:val="0D7647"/>
-          <w:sz w:val="23"/>
+          <w:color w:val="0F172A"/>
+          <w:sz w:val="22"/>
         </w:rPr>
         <w:t>ĐIỀU 3: BẢN QUYỀN HÌNH ẢNH, ÂM NHẠC &amp; TÀI SẢN DO AI TẠO RA</w:t>
       </w:r>
     </w:p>
     <w:p>
       <w:pPr>
-        <w:spacing w:after="80" w:before="0" w:line="276" w:lineRule="auto"/>
-        <w:jc w:val="left"/>
+        <w:spacing w:before="20" w:after="60" w:line="276" w:lineRule="auto"/>
+        <w:jc w:val="both"/>
       </w:pPr>
       <w:r>
         <w:t xml:space="preserve">3.1. </w:t>
@@ -516,8 +662,8 @@
     </w:p>
     <w:p>
       <w:pPr>
-        <w:spacing w:after="80" w:before="0" w:line="276" w:lineRule="auto"/>
-        <w:jc w:val="left"/>
+        <w:spacing w:before="20" w:after="60" w:line="276" w:lineRule="auto"/>
+        <w:jc w:val="both"/>
       </w:pPr>
       <w:r>
         <w:t xml:space="preserve">3.2. </w:t>
@@ -543,8 +689,8 @@
     </w:p>
     <w:p>
       <w:pPr>
-        <w:spacing w:after="80" w:before="0" w:line="276" w:lineRule="auto"/>
-        <w:jc w:val="left"/>
+        <w:spacing w:before="20" w:after="60" w:line="276" w:lineRule="auto"/>
+        <w:jc w:val="both"/>
       </w:pPr>
       <w:r>
         <w:t xml:space="preserve">3.3. </w:t>
@@ -558,28 +704,28 @@
     </w:p>
     <w:p>
       <w:pPr>
-        <w:spacing w:after="60" w:before="20" w:line="276" w:lineRule="auto"/>
+        <w:spacing w:before="20" w:after="40" w:line="276" w:lineRule="auto"/>
         <w:ind w:left="360"/>
-        <w:jc w:val="left"/>
+        <w:jc w:val="both"/>
       </w:pPr>
       <w:r>
-        <w:t>•  Đối với video ngắn trên TikTok/Reels: Sử dụng thư viện âm nhạc thương mại có sẵn của nền tảng (Commercial Music Library).</w:t>
+        <w:t>Đối với video ngắn trên TikTok/Reels: Sử dụng thư viện âm nhạc thương mại có sẵn của nền tảng (Commercial Music Library).</w:t>
       </w:r>
     </w:p>
     <w:p>
       <w:pPr>
-        <w:spacing w:after="60" w:before="20" w:line="276" w:lineRule="auto"/>
+        <w:spacing w:before="20" w:after="40" w:line="276" w:lineRule="auto"/>
         <w:ind w:left="360"/>
-        <w:jc w:val="left"/>
+        <w:jc w:val="both"/>
       </w:pPr>
       <w:r>
-        <w:t xml:space="preserve">•  Đối với ấn phẩm thiết kế: Sử dụng phông chữ thương mại được cấp phép hoặc phông chữ mở (Google Fonts). Bên B không chịu trách nhiệm nếu nền tảng mạng xã hội tắt tiếng video do chính sách bản quyền âm nhạc quốc tế thay đổi.  </w:t>
+        <w:t>Đối với ấn phẩm thiết kế: Sử dụng phông chữ thương mại được cấp phép hoặc phông chữ mở (Google Fonts). Bên B không chịu trách nhiệm nếu nền tảng mạng xã hội tắt tiếng video do chính sách bản quyền âm nhạc quốc tế thay đổi.</w:t>
       </w:r>
     </w:p>
     <w:p>
       <w:pPr>
-        <w:spacing w:after="80" w:before="0" w:line="276" w:lineRule="auto"/>
-        <w:jc w:val="left"/>
+        <w:spacing w:before="20" w:after="60" w:line="276" w:lineRule="auto"/>
+        <w:jc w:val="both"/>
       </w:pPr>
       <w:r>
         <w:t xml:space="preserve">3.4. </w:t>
@@ -593,8 +739,8 @@
     </w:p>
     <w:p>
       <w:pPr>
-        <w:spacing w:after="80" w:before="0" w:line="276" w:lineRule="auto"/>
-        <w:jc w:val="left"/>
+        <w:spacing w:before="20" w:after="60" w:line="276" w:lineRule="auto"/>
+        <w:jc w:val="both"/>
       </w:pPr>
       <w:r>
         <w:t>Hai Bên thống nhất rằng một số hình ảnh minh họa bối cảnh hoặc hình ảnh đồ họa có thể được tạo ra với sự hỗ trợ của các công cụ Trí tuệ Nhân tạo có bản quyền thương mại (Midjourney, ChatGPT Plus). Các hình ảnh này tuân thủ thuần phong mỹ tục, không sao chép phong cách của bất kỳ cá nhân cụ thể nào và chỉ mang tính chất minh họa truyền thông.</w:t>
@@ -602,32 +748,22 @@
     </w:p>
     <w:p>
       <w:pPr>
-        <w:spacing w:after="120" w:before="80"/>
-      </w:pPr>
-      <w:r>
-        <w:rPr>
-          <w:color w:val="CBD5E1"/>
-        </w:rPr>
-        <w:t>―――――――――――――――――――――――――――――――――――――――――――――――――――――――</w:t>
-      </w:r>
-    </w:p>
-    <w:p>
-      <w:pPr>
-        <w:spacing w:before="160" w:after="60"/>
+        <w:spacing w:before="180" w:after="60" w:line="276" w:lineRule="auto"/>
+        <w:jc w:val="left"/>
       </w:pPr>
       <w:r>
         <w:rPr>
           <w:b/>
-          <w:color w:val="0D7647"/>
-          <w:sz w:val="23"/>
+          <w:color w:val="0F172A"/>
+          <w:sz w:val="22"/>
         </w:rPr>
         <w:t>ĐIỀU 4: TRÁCH NHIỆM PHÁP LÝ ĐỐI VỚI NỘI DUNG TUYÊN BỐ (CLAIMS) &amp; BỒI HOÀN</w:t>
       </w:r>
     </w:p>
     <w:p>
       <w:pPr>
-        <w:spacing w:after="80" w:before="0" w:line="276" w:lineRule="auto"/>
-        <w:jc w:val="left"/>
+        <w:spacing w:before="20" w:after="60" w:line="276" w:lineRule="auto"/>
+        <w:jc w:val="both"/>
       </w:pPr>
       <w:r>
         <w:t xml:space="preserve">4.1. </w:t>
@@ -644,8 +780,8 @@
     </w:p>
     <w:p>
       <w:pPr>
-        <w:spacing w:after="80" w:before="0" w:line="276" w:lineRule="auto"/>
-        <w:jc w:val="left"/>
+        <w:spacing w:before="20" w:after="60" w:line="276" w:lineRule="auto"/>
+        <w:jc w:val="both"/>
       </w:pPr>
       <w:r>
         <w:t xml:space="preserve">4.2. </w:t>
@@ -659,28 +795,28 @@
     </w:p>
     <w:p>
       <w:pPr>
-        <w:spacing w:after="60" w:before="20" w:line="276" w:lineRule="auto"/>
+        <w:spacing w:before="20" w:after="40" w:line="276" w:lineRule="auto"/>
         <w:ind w:left="360"/>
-        <w:jc w:val="left"/>
+        <w:jc w:val="both"/>
       </w:pPr>
       <w:r>
-        <w:t>•  Căn cứ Khoản 11 Điều 8 Luật Quảng cáo 2012, Bên B có quyền từ chối xuất bản các bài viết chứa từ ngữ so sánh tuyệt đối ("tốt nhất", "số 1", "cam kết chữa khỏi 100%", "trị dứt điểm") nếu Bên A không cung cấp được Giấy chứng nhận hợp pháp của cơ quan nhà nước có thẩm quyền.</w:t>
+        <w:t>Căn cứ Khoản 11 Điều 8 Luật Quảng cáo 2012, Bên B có quyền từ chối xuất bản các bài viết chứa từ ngữ so sánh tuyệt đối ("tốt nhất", "số 1", "cam kết chữa khỏi 100%", "trị dứt điểm") nếu Bên A không cung cấp được Giấy chứng nhận hợp pháp của cơ quan nhà nước có thẩm quyền.</w:t>
       </w:r>
     </w:p>
     <w:p>
       <w:pPr>
-        <w:spacing w:after="60" w:before="20" w:line="276" w:lineRule="auto"/>
+        <w:spacing w:before="20" w:after="40" w:line="276" w:lineRule="auto"/>
         <w:ind w:left="360"/>
-        <w:jc w:val="left"/>
+        <w:jc w:val="both"/>
       </w:pPr>
       <w:r>
-        <w:t xml:space="preserve">•  Bên B không chịu trách nhiệm trong trường hợp trang mạng xã hội của Bên A bị cơ quan chức năng xử phạt do Bên A tự ý đăng tải hoặc yêu cầu Bên B đăng tải các thông tin claim sai sự thật.  </w:t>
+        <w:t>Bên B không chịu trách nhiệm trong trường hợp trang mạng xã hội của Bên A bị cơ quan chức năng xử phạt do Bên A tự ý đăng tải hoặc yêu cầu Bên B đăng tải các thông tin claim sai sự thật.</w:t>
       </w:r>
     </w:p>
     <w:p>
       <w:pPr>
-        <w:spacing w:after="80" w:before="0" w:line="276" w:lineRule="auto"/>
-        <w:jc w:val="left"/>
+        <w:spacing w:before="20" w:after="60" w:line="276" w:lineRule="auto"/>
+        <w:jc w:val="both"/>
       </w:pPr>
       <w:r>
         <w:t xml:space="preserve">4.3. </w:t>
@@ -706,32 +842,22 @@
     </w:p>
     <w:p>
       <w:pPr>
-        <w:spacing w:after="120" w:before="80"/>
-      </w:pPr>
-      <w:r>
-        <w:rPr>
-          <w:color w:val="CBD5E1"/>
-        </w:rPr>
-        <w:t>―――――――――――――――――――――――――――――――――――――――――――――――――――――――</w:t>
-      </w:r>
-    </w:p>
-    <w:p>
-      <w:pPr>
-        <w:spacing w:before="160" w:after="60"/>
+        <w:spacing w:before="180" w:after="60" w:line="276" w:lineRule="auto"/>
+        <w:jc w:val="left"/>
       </w:pPr>
       <w:r>
         <w:rPr>
           <w:b/>
-          <w:color w:val="0D7647"/>
-          <w:sz w:val="23"/>
+          <w:color w:val="0F172A"/>
+          <w:sz w:val="22"/>
         </w:rPr>
         <w:t>BIỂU MẪU ĐÍNH KÈM: PHIẾU PHÊ DUYỆT NỘI DUNG (CONTENT APPROVAL FORM)</w:t>
       </w:r>
     </w:p>
     <w:p>
       <w:pPr>
-        <w:spacing w:after="80" w:before="0" w:line="276" w:lineRule="auto"/>
-        <w:jc w:val="left"/>
+        <w:spacing w:before="20" w:after="60" w:line="276" w:lineRule="auto"/>
+        <w:jc w:val="both"/>
       </w:pPr>
       <w:r>
         <w:rPr>
@@ -742,15 +868,15 @@
     </w:p>
     <w:p>
       <w:pPr>
-        <w:spacing w:after="60" w:before="20" w:line="276" w:lineRule="auto"/>
+        <w:spacing w:before="20" w:after="40" w:line="276" w:lineRule="auto"/>
         <w:ind w:left="360"/>
-        <w:jc w:val="left"/>
+        <w:jc w:val="both"/>
       </w:pPr>
       <w:r>
         <w:rPr>
           <w:b/>
         </w:rPr>
-        <w:t>•  Mã bài viết (Post ID):</w:t>
+        <w:t>Mã bài viết (Post ID):</w:t>
       </w:r>
       <w:r>
         <w:t xml:space="preserve"> </w:t>
@@ -758,23 +884,22 @@
       <w:r>
         <w:rPr>
           <w:rFonts w:ascii="Consolas" w:hAnsi="Consolas"/>
-          <w:color w:val="B42828"/>
-          <w:sz w:val="20"/>
+          <w:sz w:val="19"/>
         </w:rPr>
         <w:t>POST-[THÁNG]-[SỐ_THỨ_TỰ]</w:t>
       </w:r>
     </w:p>
     <w:p>
       <w:pPr>
-        <w:spacing w:after="60" w:before="20" w:line="276" w:lineRule="auto"/>
+        <w:spacing w:before="20" w:after="40" w:line="276" w:lineRule="auto"/>
         <w:ind w:left="360"/>
-        <w:jc w:val="left"/>
+        <w:jc w:val="both"/>
       </w:pPr>
       <w:r>
         <w:rPr>
           <w:b/>
         </w:rPr>
-        <w:t>•  Kênh phát hành dự kiến:</w:t>
+        <w:t>Kênh phát hành dự kiến:</w:t>
       </w:r>
       <w:r>
         <w:t xml:space="preserve"> [Facebook / TikTok / Website / Google Maps]</w:t>
@@ -782,15 +907,15 @@
     </w:p>
     <w:p>
       <w:pPr>
-        <w:spacing w:after="60" w:before="20" w:line="276" w:lineRule="auto"/>
+        <w:spacing w:before="20" w:after="40" w:line="276" w:lineRule="auto"/>
         <w:ind w:left="360"/>
-        <w:jc w:val="left"/>
+        <w:jc w:val="both"/>
       </w:pPr>
       <w:r>
         <w:rPr>
           <w:b/>
         </w:rPr>
-        <w:t>•  Thời gian đăng dự kiến:</w:t>
+        <w:t>Thời gian đăng dự kiến:</w:t>
       </w:r>
       <w:r>
         <w:t xml:space="preserve"> [GIỜ:PHÚT], ngày [NGÀY/THÁNG/NĂM]</w:t>
@@ -798,15 +923,15 @@
     </w:p>
     <w:p>
       <w:pPr>
-        <w:spacing w:after="60" w:before="20" w:line="276" w:lineRule="auto"/>
+        <w:spacing w:before="20" w:after="40" w:line="276" w:lineRule="auto"/>
         <w:ind w:left="360"/>
-        <w:jc w:val="left"/>
+        <w:jc w:val="both"/>
       </w:pPr>
       <w:r>
         <w:rPr>
           <w:b/>
         </w:rPr>
-        <w:t>•  Tiêu đề bài viết / Headline:</w:t>
+        <w:t>Tiêu đề bài viết / Headline:</w:t>
       </w:r>
       <w:r>
         <w:t xml:space="preserve"> ............................................................................................</w:t>
@@ -814,15 +939,15 @@
     </w:p>
     <w:p>
       <w:pPr>
-        <w:spacing w:after="60" w:before="20" w:line="276" w:lineRule="auto"/>
+        <w:spacing w:before="20" w:after="40" w:line="276" w:lineRule="auto"/>
         <w:ind w:left="360"/>
-        <w:jc w:val="left"/>
+        <w:jc w:val="both"/>
       </w:pPr>
       <w:r>
         <w:rPr>
           <w:b/>
         </w:rPr>
-        <w:t>•  Hình ảnh / Video đính kèm:</w:t>
+        <w:t>Hình ảnh / Video đính kèm:</w:t>
       </w:r>
       <w:r>
         <w:t xml:space="preserve"> </w:t>
@@ -830,33 +955,32 @@
       <w:r>
         <w:rPr>
           <w:rFonts w:ascii="Consolas" w:hAnsi="Consolas"/>
-          <w:color w:val="B42828"/>
-          <w:sz w:val="20"/>
+          <w:sz w:val="19"/>
         </w:rPr>
         <w:t>[Tên file hoặc link Google Drive / Figma]</w:t>
       </w:r>
     </w:p>
     <w:p>
       <w:pPr>
-        <w:spacing w:after="60" w:before="20" w:line="276" w:lineRule="auto"/>
+        <w:spacing w:before="20" w:after="40" w:line="276" w:lineRule="auto"/>
         <w:ind w:left="360"/>
-        <w:jc w:val="left"/>
+        <w:jc w:val="both"/>
       </w:pPr>
       <w:r>
         <w:rPr>
           <w:b/>
         </w:rPr>
-        <w:t>•  Trạng thái phê duyệt:</w:t>
+        <w:t>Trạng thái phê duyệt:</w:t>
       </w:r>
     </w:p>
     <w:p>
       <w:pPr>
-        <w:spacing w:after="60" w:before="20" w:line="276" w:lineRule="auto"/>
+        <w:spacing w:before="20" w:after="40" w:line="276" w:lineRule="auto"/>
         <w:ind w:left="360"/>
-        <w:jc w:val="left"/>
+        <w:jc w:val="both"/>
       </w:pPr>
       <w:r>
-        <w:t xml:space="preserve">•  [ ] </w:t>
+        <w:t xml:space="preserve">[ ] </w:t>
       </w:r>
       <w:r>
         <w:rPr>
@@ -876,12 +1000,12 @@
     </w:p>
     <w:p>
       <w:pPr>
-        <w:spacing w:after="60" w:before="20" w:line="276" w:lineRule="auto"/>
+        <w:spacing w:before="20" w:after="40" w:line="276" w:lineRule="auto"/>
         <w:ind w:left="360"/>
-        <w:jc w:val="left"/>
+        <w:jc w:val="both"/>
       </w:pPr>
       <w:r>
-        <w:t xml:space="preserve">•  [ ] </w:t>
+        <w:t xml:space="preserve">[ ] </w:t>
       </w:r>
       <w:r>
         <w:rPr>
@@ -899,83 +1023,321 @@
         <w:t>Bên A xác nhận nội dung, hình ảnh đạt yêu cầu và đồng ý xuất bản lên kênh chính thức.</w:t>
       </w:r>
     </w:p>
+    <w:tbl>
+      <w:tblPr>
+        <w:tblW w:type="auto" w:w="0"/>
+        <w:jc w:val="center"/>
+        <w:tblLook w:firstColumn="1" w:firstRow="1" w:lastColumn="0" w:lastRow="0" w:noHBand="0" w:noVBand="1" w:val="04A0"/>
+        <w:tblBorders>
+          <w:top w:val="none"/>
+          <w:bottom w:val="none"/>
+          <w:left w:val="none"/>
+          <w:right w:val="none"/>
+          <w:insideH w:val="none"/>
+          <w:insideV w:val="none"/>
+        </w:tblBorders>
+      </w:tblPr>
+      <w:tblGrid>
+        <w:gridCol w:w="4874"/>
+        <w:gridCol w:w="4874"/>
+      </w:tblGrid>
+      <w:tr>
+        <w:trPr>
+          <w:cantSplit/>
+        </w:trPr>
+        <w:tc>
+          <w:tcPr>
+            <w:tcW w:type="dxa" w:w="4867"/>
+            <w:vAlign w:val="center"/>
+            <w:tcW w:w="4867" w:type="dxa"/>
+            <w:tcMar>
+              <w:top w:w="60" w:type="dxa"/>
+              <w:bottom w:w="60" w:type="dxa"/>
+              <w:left w:w="60" w:type="dxa"/>
+              <w:right w:w="60" w:type="dxa"/>
+            </w:tcMar>
+            <w:shd w:fill="FFFFFF"/>
+          </w:tcPr>
+          <w:p>
+            <w:r/>
+          </w:p>
+          <w:p>
+            <w:pPr>
+              <w:spacing w:before="0" w:after="40" w:line="276" w:lineRule="auto"/>
+              <w:jc w:val="center"/>
+            </w:pPr>
+            <w:r>
+              <w:t>ĐẠI DIỆN BÊN A (KHÁCH HÀNG)</w:t>
+            </w:r>
+          </w:p>
+        </w:tc>
+        <w:tc>
+          <w:tcPr>
+            <w:tcW w:type="dxa" w:w="4882"/>
+            <w:vAlign w:val="center"/>
+            <w:tcW w:w="4881" w:type="dxa"/>
+            <w:tcMar>
+              <w:top w:w="60" w:type="dxa"/>
+              <w:bottom w:w="60" w:type="dxa"/>
+              <w:left w:w="60" w:type="dxa"/>
+              <w:right w:w="60" w:type="dxa"/>
+            </w:tcMar>
+            <w:shd w:fill="FFFFFF"/>
+          </w:tcPr>
+          <w:p>
+            <w:r/>
+          </w:p>
+          <w:p>
+            <w:pPr>
+              <w:spacing w:before="0" w:after="40" w:line="276" w:lineRule="auto"/>
+              <w:jc w:val="center"/>
+            </w:pPr>
+            <w:r>
+              <w:t>ĐẠI DIỆN BÊN B (LOCALMATE)</w:t>
+            </w:r>
+          </w:p>
+        </w:tc>
+      </w:tr>
+      <w:tr>
+        <w:trPr>
+          <w:cantSplit/>
+        </w:trPr>
+        <w:tc>
+          <w:tcPr>
+            <w:tcW w:type="dxa" w:w="4867"/>
+            <w:vAlign w:val="center"/>
+            <w:tcW w:w="4867" w:type="dxa"/>
+            <w:tcMar>
+              <w:top w:w="60" w:type="dxa"/>
+              <w:bottom w:w="60" w:type="dxa"/>
+              <w:left w:w="60" w:type="dxa"/>
+              <w:right w:w="60" w:type="dxa"/>
+            </w:tcMar>
+            <w:shd w:fill="FFFFFF"/>
+          </w:tcPr>
+          <w:p>
+            <w:r/>
+          </w:p>
+          <w:p>
+            <w:pPr>
+              <w:spacing w:before="0" w:after="40" w:line="276" w:lineRule="auto"/>
+              <w:jc w:val="center"/>
+            </w:pPr>
+            <w:r>
+              <w:rPr>
+                <w:i/>
+                <w:color w:val="64748B"/>
+                <w:sz w:val="19"/>
+              </w:rPr>
+              <w:t>(Ký tên, ghi rõ họ tên và đóng dấu)</w:t>
+            </w:r>
+          </w:p>
+        </w:tc>
+        <w:tc>
+          <w:tcPr>
+            <w:tcW w:type="dxa" w:w="4882"/>
+            <w:vAlign w:val="center"/>
+            <w:tcW w:w="4881" w:type="dxa"/>
+            <w:tcMar>
+              <w:top w:w="60" w:type="dxa"/>
+              <w:bottom w:w="60" w:type="dxa"/>
+              <w:left w:w="60" w:type="dxa"/>
+              <w:right w:w="60" w:type="dxa"/>
+            </w:tcMar>
+            <w:shd w:fill="FFFFFF"/>
+          </w:tcPr>
+          <w:p>
+            <w:r/>
+          </w:p>
+          <w:p>
+            <w:pPr>
+              <w:spacing w:before="0" w:after="40" w:line="276" w:lineRule="auto"/>
+              <w:jc w:val="center"/>
+            </w:pPr>
+            <w:r>
+              <w:rPr>
+                <w:i/>
+                <w:color w:val="64748B"/>
+                <w:sz w:val="19"/>
+              </w:rPr>
+              <w:t>(Ký tên, ghi rõ họ tên và đóng dấu)</w:t>
+            </w:r>
+          </w:p>
+        </w:tc>
+      </w:tr>
+      <w:tr>
+        <w:trPr>
+          <w:cantSplit/>
+        </w:trPr>
+        <w:tc>
+          <w:tcPr>
+            <w:tcW w:type="dxa" w:w="4867"/>
+            <w:vAlign w:val="center"/>
+            <w:tcW w:w="4867" w:type="dxa"/>
+            <w:tcMar>
+              <w:top w:w="60" w:type="dxa"/>
+              <w:bottom w:w="60" w:type="dxa"/>
+              <w:left w:w="60" w:type="dxa"/>
+              <w:right w:w="60" w:type="dxa"/>
+            </w:tcMar>
+            <w:shd w:fill="FFFFFF"/>
+          </w:tcPr>
+          <w:p>
+            <w:r/>
+          </w:p>
+          <w:p>
+            <w:pPr>
+              <w:spacing w:before="0" w:after="40" w:line="276" w:lineRule="auto"/>
+              <w:jc w:val="center"/>
+            </w:pPr>
+          </w:p>
+          <w:p>
+            <w:pPr>
+              <w:spacing w:before="0" w:after="40" w:line="276" w:lineRule="auto"/>
+              <w:jc w:val="center"/>
+            </w:pPr>
+          </w:p>
+          <w:p>
+            <w:pPr>
+              <w:spacing w:before="0" w:after="40" w:line="276" w:lineRule="auto"/>
+              <w:jc w:val="center"/>
+            </w:pPr>
+          </w:p>
+          <w:p>
+            <w:pPr>
+              <w:spacing w:before="0" w:after="40" w:line="276" w:lineRule="auto"/>
+              <w:jc w:val="center"/>
+            </w:pPr>
+          </w:p>
+          <w:p>
+            <w:pPr>
+              <w:spacing w:before="0" w:after="40" w:line="276" w:lineRule="auto"/>
+              <w:jc w:val="center"/>
+            </w:pPr>
+          </w:p>
+        </w:tc>
+        <w:tc>
+          <w:tcPr>
+            <w:tcW w:type="dxa" w:w="4882"/>
+            <w:vAlign w:val="center"/>
+            <w:tcW w:w="4881" w:type="dxa"/>
+            <w:tcMar>
+              <w:top w:w="60" w:type="dxa"/>
+              <w:bottom w:w="60" w:type="dxa"/>
+              <w:left w:w="60" w:type="dxa"/>
+              <w:right w:w="60" w:type="dxa"/>
+            </w:tcMar>
+            <w:shd w:fill="FFFFFF"/>
+          </w:tcPr>
+          <w:p>
+            <w:r/>
+          </w:p>
+          <w:p>
+            <w:pPr>
+              <w:spacing w:before="0" w:after="40" w:line="276" w:lineRule="auto"/>
+              <w:jc w:val="center"/>
+            </w:pPr>
+          </w:p>
+          <w:p>
+            <w:pPr>
+              <w:spacing w:before="0" w:after="40" w:line="276" w:lineRule="auto"/>
+              <w:jc w:val="center"/>
+            </w:pPr>
+          </w:p>
+          <w:p>
+            <w:pPr>
+              <w:spacing w:before="0" w:after="40" w:line="276" w:lineRule="auto"/>
+              <w:jc w:val="center"/>
+            </w:pPr>
+          </w:p>
+          <w:p>
+            <w:pPr>
+              <w:spacing w:before="0" w:after="40" w:line="276" w:lineRule="auto"/>
+              <w:jc w:val="center"/>
+            </w:pPr>
+          </w:p>
+          <w:p>
+            <w:pPr>
+              <w:spacing w:before="0" w:after="40" w:line="276" w:lineRule="auto"/>
+              <w:jc w:val="center"/>
+            </w:pPr>
+          </w:p>
+        </w:tc>
+      </w:tr>
+      <w:tr>
+        <w:trPr>
+          <w:cantSplit/>
+        </w:trPr>
+        <w:tc>
+          <w:tcPr>
+            <w:tcW w:type="dxa" w:w="4867"/>
+            <w:vAlign w:val="center"/>
+            <w:tcW w:w="4867" w:type="dxa"/>
+            <w:tcMar>
+              <w:top w:w="60" w:type="dxa"/>
+              <w:bottom w:w="60" w:type="dxa"/>
+              <w:left w:w="60" w:type="dxa"/>
+              <w:right w:w="60" w:type="dxa"/>
+            </w:tcMar>
+            <w:shd w:fill="FFFFFF"/>
+          </w:tcPr>
+          <w:p>
+            <w:r/>
+          </w:p>
+          <w:p>
+            <w:pPr>
+              <w:spacing w:before="0" w:after="40" w:line="276" w:lineRule="auto"/>
+              <w:jc w:val="center"/>
+            </w:pPr>
+            <w:r>
+              <w:rPr>
+                <w:b/>
+                <w:sz w:val="22"/>
+              </w:rPr>
+              <w:t>[NGƯỜI_ĐẠI_DIỆN_A]</w:t>
+            </w:r>
+          </w:p>
+        </w:tc>
+        <w:tc>
+          <w:tcPr>
+            <w:tcW w:type="dxa" w:w="4882"/>
+            <w:vAlign w:val="center"/>
+            <w:tcW w:w="4881" w:type="dxa"/>
+            <w:tcMar>
+              <w:top w:w="60" w:type="dxa"/>
+              <w:bottom w:w="60" w:type="dxa"/>
+              <w:left w:w="60" w:type="dxa"/>
+              <w:right w:w="60" w:type="dxa"/>
+            </w:tcMar>
+            <w:shd w:fill="FFFFFF"/>
+          </w:tcPr>
+          <w:p>
+            <w:r/>
+          </w:p>
+          <w:p>
+            <w:pPr>
+              <w:spacing w:before="0" w:after="40" w:line="276" w:lineRule="auto"/>
+              <w:jc w:val="center"/>
+            </w:pPr>
+            <w:r>
+              <w:rPr>
+                <w:b/>
+                <w:sz w:val="22"/>
+              </w:rPr>
+              <w:t>[NGƯỜI_ĐẠI_DIỆN_B]</w:t>
+            </w:r>
+          </w:p>
+        </w:tc>
+      </w:tr>
+    </w:tbl>
     <w:p>
       <w:pPr>
-        <w:spacing w:after="120" w:before="80"/>
+        <w:spacing w:before="0" w:after="80"/>
       </w:pPr>
-      <w:r>
-        <w:rPr>
-          <w:color w:val="CBD5E1"/>
-        </w:rPr>
-        <w:t>―――――――――――――――――――――――――――――――――――――――――――――――――――――――</w:t>
-      </w:r>
-    </w:p>
-    <w:p>
-      <w:pPr>
-        <w:spacing w:before="160" w:after="60"/>
-      </w:pPr>
-      <w:r>
-        <w:rPr>
-          <w:b/>
-          <w:color w:val="0D7647"/>
-          <w:sz w:val="23"/>
-        </w:rPr>
-        <w:t>ĐẠI DIỆN CÁC BÊN KÝ TÊN</w:t>
-      </w:r>
-    </w:p>
-    <w:p>
-      <w:pPr>
-        <w:spacing w:after="80" w:before="0" w:line="276" w:lineRule="auto"/>
-        <w:jc w:val="left"/>
-      </w:pPr>
-      <w:r>
-        <w:rPr>
-          <w:rFonts w:ascii="Consolas" w:hAnsi="Consolas"/>
-          <w:color w:val="B42828"/>
-          <w:sz w:val="20"/>
-        </w:rPr>
-      </w:r>
-      <w:r>
-        <w:t>`</w:t>
-      </w:r>
-    </w:p>
-    <w:p>
-      <w:pPr>
-        <w:spacing w:after="80" w:before="0" w:line="276" w:lineRule="auto"/>
-        <w:jc w:val="left"/>
-      </w:pPr>
-      <w:r>
-        <w:t xml:space="preserve">             ĐẠI DIỆN BÊN A                                   ĐẠI DIỆN BÊN B</w:t>
-      </w:r>
-    </w:p>
-    <w:p>
-      <w:pPr>
-        <w:spacing w:after="80" w:before="0" w:line="276" w:lineRule="auto"/>
-        <w:jc w:val="left"/>
-      </w:pPr>
-      <w:r>
-        <w:t xml:space="preserve">  (Ký tên, đóng dấu hoặc Ký số điện tử)             (Ký tên, đóng dấu hoặc Ký số điện tử)</w:t>
-      </w:r>
-    </w:p>
-    <w:p>
-      <w:pPr>
-        <w:spacing w:after="80" w:before="0" w:line="276" w:lineRule="auto"/>
-        <w:jc w:val="left"/>
-      </w:pPr>
-      <w:r>
-        <w:rPr>
-          <w:rFonts w:ascii="Consolas" w:hAnsi="Consolas"/>
-          <w:color w:val="B42828"/>
-          <w:sz w:val="20"/>
-        </w:rPr>
-      </w:r>
-      <w:r>
-        <w:t>`</w:t>
-      </w:r>
     </w:p>
     <w:sectPr>
       <w:pgSz w:w="11909" w:h="16834"/>
-      <w:pgMar w:top="1152" w:right="1152" w:bottom="1152" w:left="1152" w:header="720" w:footer="720" w:gutter="0"/>
+      <w:pgMar w:top="1138" w:right="936" w:bottom="1138" w:left="1224" w:header="720" w:footer="720" w:gutter="0"/>
       <w:cols w:space="720"/>
       <w:docGrid w:linePitch="360"/>
     </w:sectPr>
@@ -1348,7 +1710,7 @@
     <w:rsid w:val="00FC693F"/>
     <w:rPr>
       <w:rFonts w:ascii="Times New Roman" w:hAnsi="Times New Roman"/>
-      <w:color w:val="1E293B"/>
+      <w:color w:val="0F172A"/>
       <w:sz w:val="22"/>
     </w:rPr>
   </w:style>

</xml_diff>